<commit_message>
test(docx): add clamp() font-size calculations for 800px viewport
</commit_message>
<xml_diff>
--- a/Ejercicios/Semana05/clase #9/Actividad 01.docx
+++ b/Ejercicios/Semana05/clase #9/Actividad 01.docx
@@ -28,16 +28,22 @@
       </w:r>
     </w:p>
     <w:p>
+      <w:r>
+        <w:t>Fix: agregando las etiquetas correctas</w:t>
+      </w:r>
+      <w:r>
+        <w:t xml:space="preserve"> dentro el &lt;header&gt;</w:t>
+      </w:r>
+    </w:p>
+    <w:p/>
+    <w:p>
       <w:pPr>
         <w:rPr>
           <w:u w:val="single"/>
         </w:rPr>
       </w:pPr>
       <w:r>
-        <w:t>Fix: agregando las etiquetas correctas</w:t>
-      </w:r>
-      <w:r>
-        <w:t xml:space="preserve"> dentro el &lt;header&gt;</w:t>
+        <w:t>1rem = 16px</w:t>
       </w:r>
     </w:p>
     <w:sectPr>

</xml_diff>